<commit_message>
Rewrite the abstract in the register of version 1; fill in affiliation
The version 2 abstract ran to 423 words and opened with two paragraphs about a
defective equation. It is rewritten on the structure of version 1's abstract:
one paragraph, 217 words, opening on the clinical stakes and the two organisms,
with the finding stated affirmatively as what governs treatment duration. The
closed-form equation is out of the abstract entirely.

The disclosures stay: version 1's results are withdrawn, there is no
experimental data, and the parameters are illustrative.

Affiliation filled in from the most recent prior manuscript, replacing the
placeholder that would otherwise have been posted.

Also fixes two defects in the converter and the text: hard-wrapped prose arrived
in Word as a stack of one-line paragraphs, which is why the change summary and
the abstract rendered ragged; and one sentence in the change summary was
incomplete.
</commit_message>
<xml_diff>
--- a/submission/biorxiv_v2/Piranfar_persistence_framework_bioRxiv_v2.docx
+++ b/submission/biorxiv_v2/Piranfar_persistence_framework_bioRxiv_v2.docx
@@ -19,16 +19,24 @@
       </w:r>
     </w:p>
     <w:p>
-      <w:r>
-        <w:rPr>
-          <w:i/>
-        </w:rPr>
-        <w:t>Affiliation to be completed before submission.</w:t>
+      <w:pPr>
+        <w:pStyle w:val="ListNumber"/>
+      </w:pPr>
+      <w:r>
+        <w:t>Independent Researcher, Jersey City, NJ, USA</w:t>
       </w:r>
     </w:p>
     <w:p>
-      <w:r>
-        <w:t>ORCID 0000-0003-3653-5739 · vahab.p@gmail.com</w:t>
+      <w:pPr>
+        <w:pStyle w:val="ListNumber"/>
+      </w:pPr>
+      <w:r>
+        <w:t>Farname Inc, Ontario, Canada</w:t>
+      </w:r>
+    </w:p>
+    <w:p>
+      <w:r>
+        <w:t>Corresponding author: Vahhab Piranfar, Independent Researcher, Jersey City, NJ, USA. ORCID 0000-0003-3653-5739 · vahab.p@gmail.com</w:t>
       </w:r>
     </w:p>
     <w:p>
@@ -38,10 +46,8 @@
         </w:rPr>
         <w:t>Revised manuscript, version 2.</w:t>
       </w:r>
-    </w:p>
-    <w:p>
-      <w:r>
-        <w:t>Supersedes bioRxiv 10.1101/2025.02.12.637810 (posted 14 February 2025).</w:t>
+      <w:r>
+        <w:t xml:space="preserve"> Supersedes bioRxiv 10.1101/2025.02.12.637810 (posted 14 February 2025).</w:t>
       </w:r>
     </w:p>
     <w:p>
@@ -54,12 +60,7 @@
     </w:p>
     <w:p>
       <w:r>
-        <w:t>This version corrects errors in version 1 that alter its conclusions. Readers of</w:t>
-      </w:r>
-    </w:p>
-    <w:p>
-      <w:r>
-        <w:t>version 1 should treat its quantitative results as withdrawn.</w:t>
+        <w:t>This version corrects errors in version 1 that alter its conclusions. Readers of version 1 should treat its quantitative results as withdrawn.</w:t>
       </w:r>
     </w:p>
     <w:p>
@@ -70,47 +71,7 @@
         <w:t>Mathematics.</w:t>
       </w:r>
       <w:r>
-        <w:t xml:space="preserve"> The biphasic killing law of version 1 (its Equation 4) is</w:t>
-      </w:r>
-    </w:p>
-    <w:p>
-      <w:r>
-        <w:t>discontinuous: at the transition time its second branch evaluates to exactly the</w:t>
-      </w:r>
-    </w:p>
-    <w:p>
-      <w:r>
-        <w:t>inoculum, so the modelled population rises by 2.6 to 3.5 log10 at the breakpoint.</w:t>
-      </w:r>
-    </w:p>
-    <w:p>
-      <w:r>
-        <w:t>It also converges to a permanent floor, making sterilisation impossible at any</w:t>
-      </w:r>
-    </w:p>
-    <w:p>
-      <w:r>
-        <w:t>duration. Its transition time is not an independent parameter and, on time-kill</w:t>
-      </w:r>
-    </w:p>
-    <w:p>
-      <w:r>
-        <w:t>data of realistic density, is not estimable at all. The resistance equation</w:t>
-      </w:r>
-    </w:p>
-    <w:p>
-      <w:r>
-        <w:t>omitted the carrying capacity declared alongside it and reached 10^57 CFU/mL by</w:t>
-      </w:r>
-    </w:p>
-    <w:p>
-      <w:r>
-        <w:t>day 10. The tolerance equation omitted replication, which reverses the sign of</w:t>
-      </w:r>
-    </w:p>
-    <w:p>
-      <w:r>
-        <w:t xml:space="preserve">its result for </w:t>
+        <w:t xml:space="preserve"> The biphasic killing law of version 1 (its Equation 4) is discontinuous: at the transition time its second branch evaluates to exactly the inoculum, so the modelled population rises by 2.6 to 3.5 log10 at the breakpoint. It also converges to a permanent floor, making sterilisation impossible at any duration. Its transition time is not an independent parameter and, on time-kill data of realistic density, is not estimable at all. The resistance equation omitted the carrying capacity declared alongside it and reached 10^57 CFU/mL by day 10. The tolerance equation omitted replication, which reverses the sign of its result for </w:t>
       </w:r>
       <w:r>
         <w:rPr>
@@ -119,12 +80,7 @@
         <w:t>S. aureus</w:t>
       </w:r>
       <w:r>
-        <w:t>: version 1 reported fifteen logs of killing where its</w:t>
-      </w:r>
-    </w:p>
-    <w:p>
-      <w:r>
-        <w:t>own parameters imply net growth.</w:t>
+        <w:t>: version 1 reported fifteen logs of killing where its own parameters imply net growth.</w:t>
       </w:r>
     </w:p>
     <w:p>
@@ -135,32 +91,7 @@
         <w:t>Withdrawn conclusions.</w:t>
       </w:r>
       <w:r>
-        <w:t xml:space="preserve"> Once the biphasic equation is made continuous, the two</w:t>
-      </w:r>
-    </w:p>
-    <w:p>
-      <w:r>
-        <w:t>species differ by 1.13-fold at 240 h under version 1's own parameters. The</w:t>
-      </w:r>
-    </w:p>
-    <w:p>
-      <w:r>
-        <w:t>comparative conclusion of version 1 was produced by the discontinuity and is</w:t>
-      </w:r>
-    </w:p>
-    <w:p>
-      <w:r>
-        <w:t>withdrawn. The reported persister fraction of 3.58% was an input, not a fit. The</w:t>
-      </w:r>
-    </w:p>
-    <w:p>
-      <w:r>
-        <w:t>abstract of version 1 compared two parameters drawn from different equations and</w:t>
-      </w:r>
-    </w:p>
-    <w:p>
-      <w:r>
-        <w:t>attached one species' transition time to the other.</w:t>
+        <w:t xml:space="preserve"> Once the biphasic equation is made continuous, the two species differ by 1.13-fold at 240 h under version 1's own parameters. The comparative conclusion of version 1 was produced by the discontinuity and is withdrawn. The reported persister fraction of 3.58% was an input, not a fit. The abstract of version 1 compared two parameters drawn from different equations and attached one species' transition time to the other.</w:t>
       </w:r>
     </w:p>
     <w:p>
@@ -171,32 +102,7 @@
         <w:t>Statistics.</w:t>
       </w:r>
       <w:r>
-        <w:t xml:space="preserve"> The Kolmogorov-Smirnov test of version 1 is removed: applied to</w:t>
-      </w:r>
-    </w:p>
-    <w:p>
-      <w:r>
-        <w:t>deterministic curves its p-value is set by the density of the simulation grid,</w:t>
-      </w:r>
-    </w:p>
-    <w:p>
-      <w:r>
-        <w:t>falling by more than 170 orders of magnitude as the grid is refined. The reported</w:t>
-      </w:r>
-    </w:p>
-    <w:p>
-      <w:r>
-        <w:t>R-squared above 0.9 is no longer used for model selection, because a structurally</w:t>
-      </w:r>
-    </w:p>
-    <w:p>
-      <w:r>
-        <w:t>broken model and its correct replacement both exceed it on the same data while</w:t>
-      </w:r>
-    </w:p>
-    <w:p>
-      <w:r>
-        <w:t>their corrected AIC differs by up to 84.</w:t>
+        <w:t xml:space="preserve"> The Kolmogorov-Smirnov test of version 1 is removed: applied to deterministic curves its p-value is set by the density of the simulation grid, falling by more than 170 orders of magnitude as the grid is refined. The reported R-squared above 0.9 is no longer used for model selection, because a structurally broken model and its correct replacement both exceed it on the same data while their corrected AIC differs by up to 84.</w:t>
       </w:r>
     </w:p>
     <w:p>
@@ -207,22 +113,7 @@
         <w:t>Version 1's experimental-data figure is withdrawn.</w:t>
       </w:r>
       <w:r>
-        <w:t xml:space="preserve"> It was captioned "experimental data vs.</w:t>
-      </w:r>
-    </w:p>
-    <w:p>
-      <w:r>
-        <w:t>model fitting". No dataset was named in version 1 and none exists. The</w:t>
-      </w:r>
-    </w:p>
-    <w:p>
-      <w:r>
-        <w:t>replacement figure in this version uses synthetic data with known ground truth,</w:t>
-      </w:r>
-    </w:p>
-    <w:p>
-      <w:r>
-        <w:t>is labelled as such, and supports conclusions about the estimator only.</w:t>
+        <w:t xml:space="preserve"> It was captioned "experimental data vs. model fitting". No dataset was named in version 1 and none exists. The replacement figure in this version uses synthetic data with known ground truth, is labelled as such, and supports conclusions about the estimator only.</w:t>
       </w:r>
     </w:p>
     <w:p>
@@ -233,27 +124,7 @@
         <w:t>Methods corrected.</w:t>
       </w:r>
       <w:r>
-        <w:t xml:space="preserve"> Version 1 stated that differential equations were solved</w:t>
-      </w:r>
-    </w:p>
-    <w:p>
-      <w:r>
-        <w:t>with LSODA and cross-validated with Euler integration. Every model in version 1</w:t>
-      </w:r>
-    </w:p>
-    <w:p>
-      <w:r>
-        <w:t>is a closed-form algebraic solution; nothing was integrated. That sentence is</w:t>
-      </w:r>
-    </w:p>
-    <w:p>
-      <w:r>
-        <w:t>removed. The present version does contain a genuine initial value problem and</w:t>
-      </w:r>
-    </w:p>
-    <w:p>
-      <w:r>
-        <w:t>states where.</w:t>
+        <w:t xml:space="preserve"> Version 1 stated that differential equations were solved with LSODA and cross-validated with Euler integration. Every model in version 1 is a closed-form algebraic solution; nothing was integrated. That sentence is removed. The present version does contain a genuine initial value problem, the state-structured model of Section 2.3, and names the solver used for it.</w:t>
       </w:r>
     </w:p>
     <w:p>
@@ -264,27 +135,7 @@
         <w:t>References.</w:t>
       </w:r>
       <w:r>
-        <w:t xml:space="preserve"> All thirty references of version 1 were checked against PubMed.</w:t>
-      </w:r>
-    </w:p>
-    <w:p>
-      <w:r>
-        <w:t>Seventeen verified, eleven required correction, and two could not be located and</w:t>
-      </w:r>
-    </w:p>
-    <w:p>
-      <w:r>
-        <w:t>are removed. Version 1's reference 3, the consensus definitions paper this work</w:t>
-      </w:r>
-    </w:p>
-    <w:p>
-      <w:r>
-        <w:t>depends on, was cited with the wrong title, the wrong issue and an author who is</w:t>
-      </w:r>
-    </w:p>
-    <w:p>
-      <w:r>
-        <w:t>not on it. The corrected list carries a PMID for every entry.</w:t>
+        <w:t xml:space="preserve"> All thirty references of version 1 were checked against PubMed. Seventeen verified, eleven required correction, and two could not be located and are removed. Version 1's reference 3, the consensus definitions paper this work depends on, was cited with the wrong title, the wrong issue and an author who is not on it. The corrected list carries a PMID for every entry.</w:t>
       </w:r>
     </w:p>
     <w:p>
@@ -295,42 +146,12 @@
         <w:t>What is added.</w:t>
       </w:r>
       <w:r>
-        <w:t xml:space="preserve"> A state-structured replacement model in which biphasic killing</w:t>
+        <w:t xml:space="preserve"> A state-structured replacement model in which biphasic killing emerges rather than being imposed, sterilisation time is finite, and the three survival strategies separate onto orthogonal measurable axes; a global sensitivity analysis; and an identifiability analysis of both the old and the new model. All code is public and regenerates every number in this version.</w:t>
       </w:r>
     </w:p>
     <w:p>
       <w:r>
-        <w:t>emerges rather than being imposed, sterilisation time is finite, and the three</w:t>
-      </w:r>
-    </w:p>
-    <w:p>
-      <w:r>
-        <w:t>survival strategies separate onto orthogonal measurable axes; a global</w:t>
-      </w:r>
-    </w:p>
-    <w:p>
-      <w:r>
-        <w:t>sensitivity analysis; and an identifiability analysis of both the old and the new</w:t>
-      </w:r>
-    </w:p>
-    <w:p>
-      <w:r>
-        <w:t>model. All code is public and regenerates every number in this version.</w:t>
-      </w:r>
-    </w:p>
-    <w:p>
-      <w:r>
-        <w:t>Every number in this version is produced by code in the accompanying repository</w:t>
-      </w:r>
-    </w:p>
-    <w:p>
-      <w:r>
-        <w:t>and can be regenerated with a single command. Numbers are cross-referenced to the</w:t>
-      </w:r>
-    </w:p>
-    <w:p>
-      <w:r>
-        <w:t>output file that contains them.</w:t>
+        <w:t>Every number in this version is produced by code in the accompanying repository and can be regenerated with a single command. Numbers are cross-referenced to the output file that contains them.</w:t>
       </w:r>
     </w:p>
     <w:p>
@@ -343,33 +164,25 @@
     </w:p>
     <w:p>
       <w:r>
-        <w:t>Resistance, tolerance and persistence are distinct bacterial survival strategies, but they are frequently modelled with the same mathematical object: a first-order exponential decay with a different rate constant. We show that this practice makes the three strategies formally indistinguishable, and we develop a state-structured pharmacodynamic model in which each has its own signature.</w:t>
-      </w:r>
-    </w:p>
-    <w:p>
-      <w:r>
-        <w:t>We first re-examined a widely used closed-form biphasic killing law of the form N(t) = N_d + (N₀ − N_d)e^(−k_slow(t−t_c)) for t ≥ t_c. This expression is not a decay law. At the transition time its second branch evaluates to exactly N₀ regardless of how much killing occurred beforehand, so the modelled population increases by 2.6 to 3.5 log₁₀ at the breakpoint, and it converges to a permanent floor at the dormant fraction, making sterilisation impossible at any duration. Its transition time is also not an independent parameter: in a two-subpopulation system t_c = ln((1−f)/f)/(k_fast − k_slow), and profile likelihood on simulated time-kill data of realistic design shows t_c to be unidentifiable in four of four sampling schemes.</w:t>
-      </w:r>
-    </w:p>
-    <w:p>
-      <w:r>
-        <w:t>We then replaced this law with a two-compartment model in which replicating and dormant subpopulations each carry a sigmoid concentration–response. Biphasic killing emerges from the compartment structure rather than being imposed by a breakpoint, sterilisation time is finite and computable, and the three survival strategies separate onto orthogonal axes of measurable quantities: resistance shifts the minimum inhibitory concentration at unchanged minimum duration for killing, tolerance multiplies the minimum duration for killing at unchanged minimum inhibitory concentration, and persistence lifts the deep killing endpoint while leaving both the minimum inhibitory concentration and the bulk killing endpoint unchanged.</w:t>
-      </w:r>
-    </w:p>
-    <w:p>
-      <w:r>
-        <w:t>Global variance-based sensitivity analysis of the replacement model identifies a determinant that the closed-form law cannot express. For the slow-growing organism, 87% of the first-order variance in time to sterilisation is carried by the rate at which dormant cells resume replication (total-order Sobol index 0.90), not by the rate at which dormant cells are killed. A dormant cell that resumes replication becomes susceptible, which places resuscitation, rather than direct killing of persisters, at the centre of regimen shortening.</w:t>
-      </w:r>
-    </w:p>
-    <w:p>
+        <w:t xml:space="preserve">Antibiotic resistance, tolerance, and persistence represent key bacterial survival strategies that impact treatment outcomes and global health. While </w:t>
+      </w:r>
       <w:r>
         <w:rPr>
-          <w:b/>
+          <w:i/>
         </w:rPr>
-        <w:t>This work is a modelling and methods contribution. It contains no experimental data.</w:t>
-      </w:r>
-      <w:r>
-        <w:t xml:space="preserve"> Parameter values are illustrative and were chosen to reproduce documented qualitative behaviour; they are not measurements, and no quantitative claim about either species should be drawn from them until the model is fitted to time-kill data. All code, intermediate tables and figure-generating scripts are provided.</w:t>
+        <w:t>Staphylococcus aureus</w:t>
+      </w:r>
+      <w:r>
+        <w:t xml:space="preserve"> is a rapidly growing pathogen associated with acute infections, </w:t>
+      </w:r>
+      <w:r>
+        <w:rPr>
+          <w:i/>
+        </w:rPr>
+        <w:t>Mycobacterium tuberculosis</w:t>
+      </w:r>
+      <w:r>
+        <w:t xml:space="preserve"> exhibits slow growth and chronic persistence, necessitating prolonged antibiotic regimens. In this study, we developed a state-structured pharmacodynamic model in which replicating and dormant subpopulations each carry their own concentration-response, so that the three strategies separate onto distinct measurable axes: resistance shifts the minimum inhibitory concentration, tolerance multiplies the minimum duration for killing, and persistence lifts the deep killing endpoint alone. Using global variance-based sensitivity analysis and profile likelihood, we identified which parameter governs the length of therapy and which parameters can be estimated at all from time-kill data. Our findings show that in the slow-growing organism 87% of the first-order variance in time to sterilisation is carried by the rate at which dormant cells resume replication, rather than by the rate at which dormant cells are killed, placing resuscitation at the centre of regimen shortening and identifying a class of intervention worth measuring. This version supersedes version 1, whose closed-form biphasic killing law is discontinuous and whose quantitative results are withdrawn and corrected here; the work is a modelling and methods contribution, contains no experimental data, and its parameter values are illustrative rather than measured.</w:t>
       </w:r>
     </w:p>
     <w:p>
@@ -4118,17 +3931,7 @@
     </w:p>
     <w:p>
       <w:r>
-        <w:t>All entries below were verified against PubMed records in September 2026. Every</w:t>
-      </w:r>
-    </w:p>
-    <w:p>
-      <w:r>
-        <w:t>entry carries a PMID. Thirteen entries from version 1 were removed or replaced;</w:t>
-      </w:r>
-    </w:p>
-    <w:p>
-      <w:r>
-        <w:t xml:space="preserve">see the note on version 2 above and </w:t>
+        <w:t xml:space="preserve">All entries below were verified against PubMed records in September 2026. Every entry carries a PMID. Thirteen entries from version 1 were removed or replaced; see the note on version 2 above and </w:t>
       </w:r>
       <w:r>
         <w:rPr>
@@ -4138,12 +3941,7 @@
         <w:t>docs/04_REFERENCE_VERIFICATION.md</w:t>
       </w:r>
       <w:r>
-        <w:t xml:space="preserve"> for the</w:t>
-      </w:r>
-    </w:p>
-    <w:p>
-      <w:r>
-        <w:t>full audit.</w:t>
+        <w:t xml:space="preserve"> for the full audit.</w:t>
       </w:r>
     </w:p>
     <w:p>
@@ -4282,12 +4080,7 @@
         <w:t>Candidate datasets named in Section 4.3 for the fitting stage.</w:t>
       </w:r>
       <w:r>
-        <w:t xml:space="preserve"> These are</w:t>
-      </w:r>
-    </w:p>
-    <w:p>
-      <w:r>
-        <w:t>cited as sources of data, not as support for any claim made here.</w:t>
+        <w:t xml:space="preserve"> These are cited as sources of data, not as support for any claim made here.</w:t>
       </w:r>
     </w:p>
     <w:p>

</xml_diff>

<commit_message>
Add continuous line numbering and page numbers to the journal build
Bulletin of Mathematical Biology requires continuous line numbering on every
page and sequential page numbers. python-docx exposes neither, so w:lnNumType
goes into the section properties directly and the page number is a PAGE field in
the footer.

The build now produces both documents from one converter: the bioRxiv version
from the numbered-reference source without line numbers, and the journal version
from the author-date source with them.
</commit_message>
<xml_diff>
--- a/submission/biorxiv_v2/Piranfar_persistence_framework_bioRxiv_v2.docx
+++ b/submission/biorxiv_v2/Piranfar_persistence_framework_bioRxiv_v2.docx
@@ -193,22 +193,7 @@
         <w:t>Keywords:</w:t>
       </w:r>
       <w:r>
-        <w:t xml:space="preserve"> antibiotic tolerance, bacterial persistence, pharmacodynamics, minimum duration for killing, structural identifiability, global sensitivity analysis, </w:t>
-      </w:r>
-      <w:r>
-        <w:rPr>
-          <w:i/>
-        </w:rPr>
-        <w:t>Mycobacterium tuberculosis</w:t>
-      </w:r>
-      <w:r>
-        <w:t xml:space="preserve">, </w:t>
-      </w:r>
-      <w:r>
-        <w:rPr>
-          <w:i/>
-        </w:rPr>
-        <w:t>Staphylococcus aureus</w:t>
+        <w:t xml:space="preserve"> antibiotic tolerance, bacterial persistence, pharmacodynamics, minimum duration for killing, practical identifiability, global sensitivity analysis</w:t>
       </w:r>
     </w:p>
     <w:p>
@@ -2398,7 +2383,16 @@
     </w:p>
     <w:p>
       <w:r>
-        <w:t>Neither asserted value lies on its own curve. Treating f, k_fast, k_slow and t_c as four free parameters over-parameterises a three-parameter system, and Section 3.8 shows that the consequence is not theoretical: t_c cannot be estimated from time-kill data of realistic density.</w:t>
+        <w:t xml:space="preserve">Neither asserted value lies on its own curve. This matters because of what the equation is for. Read as a phenomenological piecewise form, t_c is simply a free parameter and there is no inconsistency to find. Read as the two-subpopulation system it is meant to represent — a fraction f decaying at k_slow and the rest at k_fast — t_c is a </w:t>
+      </w:r>
+      <w:r>
+        <w:rPr>
+          <w:i/>
+        </w:rPr>
+        <w:t>derived</w:t>
+      </w:r>
+      <w:r>
+        <w:t xml:space="preserve"> quantity, fixed by those three, and parameterising it independently makes the system redundant. Version 1 used the second reading to justify the equation and the first to choose a number for t_c. Section 3.8 shows the practical consequence: on time-kill data of realistic density, t_c is not estimable either.</w:t>
       </w:r>
     </w:p>
     <w:p>
@@ -3643,7 +3637,16 @@
     </w:p>
     <w:p>
       <w:r>
-        <w:t xml:space="preserve">Profile likelihood on the same fits shows that the transition time of Equation 4a is not identifiable. Its 95% likelihood interval reaches the edge of the searched range in </w:t>
+        <w:t xml:space="preserve">Profile likelihood on the same fits shows that the transition time of Equation 4a is not </w:t>
+      </w:r>
+      <w:r>
+        <w:rPr>
+          <w:i/>
+        </w:rPr>
+        <w:t>practically</w:t>
+      </w:r>
+      <w:r>
+        <w:t xml:space="preserve"> identifiable on time-kill data of the density these experiments produce. Its 95% likelihood interval reaches the edge of the searched range in </w:t>
       </w:r>
       <w:r>
         <w:rPr>
@@ -3667,7 +3670,7 @@
     </w:p>
     <w:p>
       <w:r>
-        <w:t>A reported value of t_c from a fit of Equation 4a therefore carries no information about the organism. It records where the optimiser stopped.</w:t>
+        <w:t>A reported value of t_c from a fit of Equation 4a to data of this density therefore carries no information about the organism; it records where the optimiser stopped. We claim this of the sampling designs tested, which span the range time-kill experiments use, and not as a structural property of the equation: we have not carried out a structural identifiability analysis, and a design with far denser sampling around the transition might well determine t_c.</w:t>
       </w:r>
     </w:p>
     <w:p>
@@ -4142,6 +4145,7 @@
       </w:r>
     </w:p>
     <w:sectPr>
+      <w:footerReference w:type="default" r:id="rId16"/>
       <w:pgSz w:w="12240" w:h="15840"/>
       <w:pgMar w:top="1440" w:right="1800" w:bottom="1440" w:left="1800" w:header="720" w:footer="720" w:gutter="0"/>
       <w:cols w:space="720"/>
@@ -4149,6 +4153,22 @@
     </w:sectPr>
   </w:body>
 </w:document>
+</file>
+
+<file path=word/footer1.xml><?xml version="1.0" encoding="utf-8"?>
+<w:ftr xmlns:m="http://schemas.openxmlformats.org/officeDocument/2006/math" xmlns:mc="http://schemas.openxmlformats.org/markup-compatibility/2006" xmlns:mo="http://schemas.microsoft.com/office/mac/office/2008/main" xmlns:mv="urn:schemas-microsoft-com:mac:vml" xmlns:o="urn:schemas-microsoft-com:office:office" xmlns:r="http://schemas.openxmlformats.org/officeDocument/2006/relationships" xmlns:v="urn:schemas-microsoft-com:vml" xmlns:w10="urn:schemas-microsoft-com:office:word" xmlns:w14="http://schemas.microsoft.com/office/word/2010/wordml" xmlns:w="http://schemas.openxmlformats.org/wordprocessingml/2006/main" xmlns:wne="http://schemas.microsoft.com/office/word/2006/wordml" xmlns:wp14="http://schemas.microsoft.com/office/word/2010/wordprocessingDrawing" xmlns:wp="http://schemas.openxmlformats.org/drawingml/2006/wordprocessingDrawing" xmlns:wpc="http://schemas.microsoft.com/office/word/2010/wordprocessingCanvas" xmlns:wpg="http://schemas.microsoft.com/office/word/2010/wordprocessingGroup" xmlns:wpi="http://schemas.microsoft.com/office/word/2010/wordprocessingInk" xmlns:wps="http://schemas.microsoft.com/office/word/2010/wordprocessingShape" mc:Ignorable="w14 wp14">
+  <w:p>
+    <w:pPr>
+      <w:pStyle w:val="Footer"/>
+      <w:jc w:val="center"/>
+    </w:pPr>
+    <w:r>
+      <w:fldChar w:fldCharType="begin"/>
+      <w:instrText xml:space="preserve"> PAGE </w:instrText>
+      <w:fldChar w:fldCharType="end"/>
+    </w:r>
+  </w:p>
+</w:ftr>
 </file>
 
 <file path=word/numbering.xml><?xml version="1.0" encoding="utf-8"?>

</xml_diff>

<commit_message>
Point the journal build at the journal manuscript
submission/bmb held a document built from REVISED_MANUSCRIPT_authordate.md, the
preprint text with author-date references. It carried the old title and none of
the journal manuscript's content, and would have been submitted as the paper if
nobody had checked which source it came from.

The build now takes BMB_MANUSCRIPT.md, and tolerates a manuscript with no
'Figure legends' section by not embedding images at all, which is the correct
journal format: captions in a section of their own and the figure files uploaded
separately.
</commit_message>
<xml_diff>
--- a/submission/biorxiv_v2/Piranfar_persistence_framework_bioRxiv_v2.docx
+++ b/submission/biorxiv_v2/Piranfar_persistence_framework_bioRxiv_v2.docx
@@ -3529,7 +3529,7 @@
       <w:r>
         <w:drawing>
           <wp:inline xmlns:a="http://schemas.openxmlformats.org/drawingml/2006/main" xmlns:pic="http://schemas.openxmlformats.org/drawingml/2006/picture">
-            <wp:extent cx="5852160" cy="5935206"/>
+            <wp:extent cx="5852160" cy="6602171"/>
             <wp:docPr id="6" name="Picture 6"/>
             <wp:cNvGraphicFramePr>
               <a:graphicFrameLocks noChangeAspect="1"/>
@@ -3550,7 +3550,7 @@
                   <pic:spPr>
                     <a:xfrm>
                       <a:off x="0" y="0"/>
-                      <a:ext cx="5852160" cy="5935206"/>
+                      <a:ext cx="5852160" cy="6602171"/>
                     </a:xfrm>
                     <a:prstGeom prst="rect"/>
                   </pic:spPr>

</xml_diff>